<commit_message>
Geschichte 11: Figurenkarten mit Endschildern für die Gewinner-Verlierer-Linie
Co-Authored-By: Claude Opus 5.5 <noreply@anthropic.com>
Claude-Session: https://claude.ai/code/session_013iN4Tiarea1J9YUJHZ9iqC
</commit_message>
<xml_diff>
--- a/Geschichte_11/Doppelstunde_Solon/Figurenkarten_Tafel.docx
+++ b/Geschichte_11/Doppelstunde_Solon/Figurenkarten_Tafel.docx
@@ -42,11 +42,11 @@
                 <w:rFonts w:ascii="Calibri" w:cs="Calibri" w:eastAsia="Calibri" w:hAnsi="Calibri"/>
                 <w:b/>
                 <w:bCs/>
-                <w:color w:val="2B2318"/>
+                <w:color w:val="AD4426"/>
                 <w:sz w:val="120"/>
                 <w:szCs w:val="120"/>
               </w:rPr>
-              <w:t xml:space="preserve">Kleinbauer</w:t>
+              <w:t xml:space="preserve">◄  verliert</w:t>
             </w:r>
           </w:p>
         </w:tc>
@@ -76,26 +76,11 @@
                 <w:rFonts w:ascii="Calibri" w:cs="Calibri" w:eastAsia="Calibri" w:hAnsi="Calibri"/>
                 <w:b/>
                 <w:bCs/>
-                <w:color w:val="2B2318"/>
+                <w:color w:val="3C783C"/>
                 <w:sz w:val="120"/>
                 <w:szCs w:val="120"/>
               </w:rPr>
-              <w:t xml:space="preserve">Großgrundbesitzer</w:t>
-            </w:r>
-          </w:p>
-          <w:p>
-            <w:pPr>
-              <w:spacing w:before="120"/>
-              <w:jc w:val="center"/>
-            </w:pPr>
-            <w:r>
-              <w:rPr>
-                <w:rFonts w:ascii="Calibri" w:cs="Calibri" w:eastAsia="Calibri" w:hAnsi="Calibri"/>
-                <w:color w:val="5A5044"/>
-                <w:sz w:val="56"/>
-                <w:szCs w:val="56"/>
-              </w:rPr>
-              <w:t xml:space="preserve">(adlig)</w:t>
+              <w:t xml:space="preserve">gewinnt  ►</w:t>
             </w:r>
           </w:p>
         </w:tc>
@@ -155,22 +140,7 @@
                 <w:sz w:val="120"/>
                 <w:szCs w:val="120"/>
               </w:rPr>
-              <w:t xml:space="preserve">Reicher Händler</w:t>
-            </w:r>
-          </w:p>
-          <w:p>
-            <w:pPr>
-              <w:spacing w:before="120"/>
-              <w:jc w:val="center"/>
-            </w:pPr>
-            <w:r>
-              <w:rPr>
-                <w:rFonts w:ascii="Calibri" w:cs="Calibri" w:eastAsia="Calibri" w:hAnsi="Calibri"/>
-                <w:color w:val="5A5044"/>
-                <w:sz w:val="56"/>
-                <w:szCs w:val="56"/>
-              </w:rPr>
-              <w:t xml:space="preserve">(nicht adlig)</w:t>
+              <w:t xml:space="preserve">Kleinbauer</w:t>
             </w:r>
           </w:p>
         </w:tc>
@@ -204,7 +174,22 @@
                 <w:sz w:val="120"/>
                 <w:szCs w:val="120"/>
               </w:rPr>
-              <w:t xml:space="preserve">Verarmter Adliger</w:t>
+              <w:t xml:space="preserve">Großgrundbesitzer</w:t>
+            </w:r>
+          </w:p>
+          <w:p>
+            <w:pPr>
+              <w:spacing w:before="120"/>
+              <w:jc w:val="center"/>
+            </w:pPr>
+            <w:r>
+              <w:rPr>
+                <w:rFonts w:ascii="Calibri" w:cs="Calibri" w:eastAsia="Calibri" w:hAnsi="Calibri"/>
+                <w:color w:val="5A5044"/>
+                <w:sz w:val="56"/>
+                <w:szCs w:val="56"/>
+              </w:rPr>
+              <w:t xml:space="preserve">(adlig)</w:t>
             </w:r>
           </w:p>
         </w:tc>
@@ -261,10 +246,25 @@
                 <w:b/>
                 <w:bCs/>
                 <w:color w:val="2B2318"/>
-                <w:sz w:val="96"/>
-                <w:szCs w:val="96"/>
-              </w:rPr>
-              <w:t xml:space="preserve">Zurückgekaufter Schuldsklave</w:t>
+                <w:sz w:val="120"/>
+                <w:szCs w:val="120"/>
+              </w:rPr>
+              <w:t xml:space="preserve">Reicher Händler</w:t>
+            </w:r>
+          </w:p>
+          <w:p>
+            <w:pPr>
+              <w:spacing w:before="120"/>
+              <w:jc w:val="center"/>
+            </w:pPr>
+            <w:r>
+              <w:rPr>
+                <w:rFonts w:ascii="Calibri" w:cs="Calibri" w:eastAsia="Calibri" w:hAnsi="Calibri"/>
+                <w:color w:val="5A5044"/>
+                <w:sz w:val="56"/>
+                <w:szCs w:val="56"/>
+              </w:rPr>
+              <w:t xml:space="preserve">(nicht adlig)</w:t>
             </w:r>
           </w:p>
         </w:tc>
@@ -298,22 +298,7 @@
                 <w:sz w:val="120"/>
                 <w:szCs w:val="120"/>
               </w:rPr>
-              <w:t xml:space="preserve">Tagelöhner</w:t>
-            </w:r>
-          </w:p>
-          <w:p>
-            <w:pPr>
-              <w:spacing w:before="120"/>
-              <w:jc w:val="center"/>
-            </w:pPr>
-            <w:r>
-              <w:rPr>
-                <w:rFonts w:ascii="Calibri" w:cs="Calibri" w:eastAsia="Calibri" w:hAnsi="Calibri"/>
-                <w:color w:val="5A5044"/>
-                <w:sz w:val="56"/>
-                <w:szCs w:val="56"/>
-              </w:rPr>
-              <w:t xml:space="preserve">(Thete)</w:t>
+              <w:t xml:space="preserve">Verarmter Adliger</w:t>
             </w:r>
           </w:p>
         </w:tc>
@@ -370,6 +355,115 @@
                 <w:b/>
                 <w:bCs/>
                 <w:color w:val="2B2318"/>
+                <w:sz w:val="96"/>
+                <w:szCs w:val="96"/>
+              </w:rPr>
+              <w:t xml:space="preserve">Zurückgekaufter Schuldsklave</w:t>
+            </w:r>
+          </w:p>
+        </w:tc>
+      </w:tr>
+      <w:tr>
+        <w:trPr>
+          <w:cantSplit/>
+          <w:trHeight w:val="4400" w:hRule="exact"/>
+        </w:trPr>
+        <w:tc>
+          <w:tcPr>
+            <w:tcW w:type="dxa" w:w="14988"/>
+            <w:tcBorders>
+              <w:top w:val="dashed" w:color="999999" w:sz="8"/>
+              <w:left w:val="dashed" w:color="999999" w:sz="8"/>
+              <w:bottom w:val="dashed" w:color="999999" w:sz="8"/>
+              <w:right w:val="dashed" w:color="999999" w:sz="8"/>
+            </w:tcBorders>
+            <w:vAlign w:val="center"/>
+          </w:tcPr>
+          <w:p>
+            <w:pPr>
+              <w:jc w:val="center"/>
+            </w:pPr>
+            <w:r>
+              <w:rPr>
+                <w:rFonts w:ascii="Calibri" w:cs="Calibri" w:eastAsia="Calibri" w:hAnsi="Calibri"/>
+                <w:b/>
+                <w:bCs/>
+                <w:color w:val="2B2318"/>
+                <w:sz w:val="120"/>
+                <w:szCs w:val="120"/>
+              </w:rPr>
+              <w:t xml:space="preserve">Tagelöhner</w:t>
+            </w:r>
+          </w:p>
+          <w:p>
+            <w:pPr>
+              <w:spacing w:before="120"/>
+              <w:jc w:val="center"/>
+            </w:pPr>
+            <w:r>
+              <w:rPr>
+                <w:rFonts w:ascii="Calibri" w:cs="Calibri" w:eastAsia="Calibri" w:hAnsi="Calibri"/>
+                <w:color w:val="5A5044"/>
+                <w:sz w:val="56"/>
+                <w:szCs w:val="56"/>
+              </w:rPr>
+              <w:t xml:space="preserve">(Thete)</w:t>
+            </w:r>
+          </w:p>
+        </w:tc>
+      </w:tr>
+    </w:tbl>
+    <w:p>
+      <w:pPr>
+        <w:sectPr>
+          <w:pgSz w:w="16838" w:h="11906" w:orient="landscape"/>
+          <w:pgMar w:top="850" w:right="850" w:bottom="600" w:left="850" w:header="708" w:footer="708" w:gutter="0"/>
+          <w:pgNumType/>
+          <w:docGrid w:linePitch="360"/>
+        </w:sectPr>
+      </w:pPr>
+    </w:p>
+    <w:tbl>
+      <w:tblPr>
+        <w:tblW w:type="dxa" w:w="14988"/>
+        <w:tblBorders>
+          <w:top w:val="single" w:color="auto" w:sz="4"/>
+          <w:left w:val="single" w:color="auto" w:sz="4"/>
+          <w:bottom w:val="single" w:color="auto" w:sz="4"/>
+          <w:right w:val="single" w:color="auto" w:sz="4"/>
+          <w:insideH w:val="single" w:color="auto" w:sz="4"/>
+          <w:insideV w:val="single" w:color="auto" w:sz="4"/>
+        </w:tblBorders>
+      </w:tblPr>
+      <w:tblGrid>
+        <w:gridCol w:w="14988"/>
+      </w:tblGrid>
+      <w:tr>
+        <w:trPr>
+          <w:cantSplit/>
+          <w:trHeight w:val="4400" w:hRule="exact"/>
+        </w:trPr>
+        <w:tc>
+          <w:tcPr>
+            <w:tcW w:type="dxa" w:w="14988"/>
+            <w:tcBorders>
+              <w:top w:val="dashed" w:color="999999" w:sz="8"/>
+              <w:left w:val="dashed" w:color="999999" w:sz="8"/>
+              <w:bottom w:val="dashed" w:color="999999" w:sz="8"/>
+              <w:right w:val="dashed" w:color="999999" w:sz="8"/>
+            </w:tcBorders>
+            <w:vAlign w:val="center"/>
+          </w:tcPr>
+          <w:p>
+            <w:pPr>
+              <w:jc w:val="center"/>
+            </w:pPr>
+            <w:r>
+              <w:rPr>
+                <w:rFonts w:ascii="Calibri" w:cs="Calibri" w:eastAsia="Calibri" w:hAnsi="Calibri"/>
+                <w:b/>
+                <w:bCs/>
+                <w:color w:val="2B2318"/>
                 <w:sz w:val="120"/>
                 <w:szCs w:val="120"/>
               </w:rPr>

</xml_diff>